<commit_message>
Ajustes contabilización ramo de fianzas
</commit_message>
<xml_diff>
--- a/Reportes/CondGen_314.docx
+++ b/Reportes/CondGen_314.docx
@@ -4,7 +4,7 @@
   <w:body>
     <w:p>
       <w:pPr>
-        <w:framePr w:w="11210" w:h="1120" w:hRule="exact" w:wrap="auto" w:vAnchor="page" w:hAnchor="page" w:x="511" w:y="661"/>
+        <w:framePr w:w="7160" w:h="221" w:hRule="exact" w:wrap="auto" w:vAnchor="page" w:hAnchor="page" w:x="4306" w:y="2358"/>
         <w:widowControl w:val="0"/>
         <w:tabs>
           <w:tab w:val="left" w:pos="360"/>
@@ -26,65 +26,65 @@
           <w:tab w:val="left" w:pos="6120"/>
           <w:tab w:val="left" w:pos="6480"/>
           <w:tab w:val="left" w:pos="6840"/>
-          <w:tab w:val="left" w:pos="7200"/>
-          <w:tab w:val="left" w:pos="7560"/>
-          <w:tab w:val="left" w:pos="7920"/>
-          <w:tab w:val="left" w:pos="8280"/>
-          <w:tab w:val="left" w:pos="8640"/>
-          <w:tab w:val="left" w:pos="9000"/>
-          <w:tab w:val="left" w:pos="9360"/>
-          <w:tab w:val="left" w:pos="9720"/>
-          <w:tab w:val="left" w:pos="10080"/>
-          <w:tab w:val="left" w:pos="10440"/>
-          <w:tab w:val="left" w:pos="10800"/>
-          <w:tab w:val="left" w:pos="11160"/>
         </w:tabs>
         <w:autoSpaceDE w:val="0"/>
         <w:autoSpaceDN w:val="0"/>
         <w:adjustRightInd w:val="0"/>
         <w:spacing w:after="0" w:line="240" w:lineRule="auto"/>
-        <w:jc w:val="center"/>
-        <w:rPr>
-          <w:rFonts w:ascii="Arial" w:eastAsia="Times New Roman" w:hAnsi="Arial" w:cs="Arial"/>
-          <w:b/>
-          <w:color w:val="000000"/>
-          <w:kern w:val="2"/>
-          <w:sz w:val="27"/>
-          <w:szCs w:val="24"/>
-          <w:u w:val="single"/>
+        <w:rPr>
+          <w:rFonts w:ascii="Arial" w:eastAsia="Times New Roman" w:hAnsi="Arial" w:cs="Arial"/>
+          <w:b/>
+          <w:color w:val="000000"/>
+          <w:kern w:val="2"/>
+          <w:sz w:val="19"/>
+          <w:szCs w:val="24"/>
         </w:rPr>
       </w:pPr>
       <w:r>
         <w:rPr>
-          <w:noProof/>
-        </w:rPr>
-        <w:pict w14:anchorId="5C25B90E">
-          <v:rect id="_x0000_s1026" style="position:absolute;left:0;text-align:left;margin-left:24pt;margin-top:96pt;width:558pt;height:121.5pt;z-index:-2;mso-position-horizontal-relative:page;mso-position-vertical-relative:page" o:allowincell="f" filled="f" strokeweight="2pt">
-            <w10:wrap anchorx="page" anchory="page"/>
-          </v:rect>
-        </w:pict>
-      </w:r>
-      <w:r>
-        <w:rPr>
-          <w:noProof/>
-        </w:rPr>
-        <w:pict w14:anchorId="2E392C6C">
-          <v:rect id="_x0000_s1027" style="position:absolute;left:0;text-align:left;margin-left:29.25pt;margin-top:102pt;width:549pt;height:110.5pt;z-index:-1;mso-position-horizontal-relative:page;mso-position-vertical-relative:page" o:allowincell="f" filled="f" strokeweight=".5pt">
-            <w10:wrap anchorx="page" anchory="page"/>
-          </v:rect>
-        </w:pict>
-      </w:r>
-      <w:r>
-        <w:rPr>
-          <w:rFonts w:ascii="Arial" w:eastAsia="Times New Roman" w:hAnsi="Arial" w:cs="Arial"/>
-          <w:b/>
-          <w:color w:val="000000"/>
-          <w:kern w:val="2"/>
-          <w:sz w:val="27"/>
-          <w:szCs w:val="24"/>
-          <w:u w:val="single"/>
-        </w:rPr>
-        <w:t>FIANZA PARA GARANTIZAR EL PAGO DE LOS POSIBLES DAÑOS QUE</w:t>
+          <w:rFonts w:ascii="Arial" w:eastAsia="Times New Roman" w:hAnsi="Arial" w:cs="Arial"/>
+          <w:b/>
+          <w:color w:val="000000"/>
+          <w:kern w:val="2"/>
+          <w:sz w:val="19"/>
+          <w:szCs w:val="24"/>
+        </w:rPr>
+        <w:t>{</w:t>
+      </w:r>
+      <w:proofErr w:type="spellStart"/>
+      <w:r>
+        <w:rPr>
+          <w:rFonts w:ascii="Arial" w:eastAsia="Times New Roman" w:hAnsi="Arial" w:cs="Arial"/>
+          <w:b/>
+          <w:color w:val="000000"/>
+          <w:kern w:val="2"/>
+          <w:sz w:val="19"/>
+          <w:szCs w:val="24"/>
+        </w:rPr>
+        <w:t>custom.</w:t>
+      </w:r>
+      <w:r>
+        <w:rPr>
+          <w:rFonts w:ascii="Arial" w:eastAsia="Times New Roman" w:hAnsi="Arial" w:cs="Arial"/>
+          <w:b/>
+          <w:color w:val="000000"/>
+          <w:kern w:val="2"/>
+          <w:sz w:val="19"/>
+          <w:szCs w:val="24"/>
+        </w:rPr>
+        <w:t>AFavor</w:t>
+      </w:r>
+      <w:proofErr w:type="spellEnd"/>
+      <w:r>
+        <w:rPr>
+          <w:rFonts w:ascii="Arial" w:eastAsia="Times New Roman" w:hAnsi="Arial" w:cs="Arial"/>
+          <w:b/>
+          <w:color w:val="000000"/>
+          <w:kern w:val="2"/>
+          <w:sz w:val="19"/>
+          <w:szCs w:val="24"/>
+        </w:rPr>
+        <w:t>}</w:t>
       </w:r>
     </w:p>
     <w:p>
@@ -141,6 +141,26 @@
       </w:pPr>
       <w:r>
         <w:rPr>
+          <w:noProof/>
+        </w:rPr>
+        <w:pict w14:anchorId="5C25B90E">
+          <v:rect id="_x0000_s1026" style="position:absolute;left:0;text-align:left;margin-left:24pt;margin-top:96pt;width:558pt;height:121.5pt;z-index:-2;mso-position-horizontal-relative:page;mso-position-vertical-relative:page" o:allowincell="f" filled="f" strokeweight="2pt">
+            <w10:wrap anchorx="page" anchory="page"/>
+          </v:rect>
+        </w:pict>
+      </w:r>
+      <w:r>
+        <w:rPr>
+          <w:noProof/>
+        </w:rPr>
+        <w:pict w14:anchorId="2E392C6C">
+          <v:rect id="_x0000_s1027" style="position:absolute;left:0;text-align:left;margin-left:29.25pt;margin-top:102pt;width:549pt;height:110.5pt;z-index:-1;mso-position-horizontal-relative:page;mso-position-vertical-relative:page" o:allowincell="f" filled="f" strokeweight=".5pt">
+            <w10:wrap anchorx="page" anchory="page"/>
+          </v:rect>
+        </w:pict>
+      </w:r>
+      <w:r>
+        <w:rPr>
           <w:rFonts w:ascii="Arial" w:eastAsia="Times New Roman" w:hAnsi="Arial" w:cs="Arial"/>
           <w:b/>
           <w:color w:val="000000"/>
@@ -149,7 +169,7 @@
           <w:szCs w:val="24"/>
           <w:u w:val="single"/>
         </w:rPr>
-        <w:t>PUDIERAN OCASIONARSE POR EL LEVANTAMIENTO DE UN</w:t>
+        <w:t>FIANZA PARA GARANTIZAR EL PAGO DE LOS POSIBLES DAÑOS QUE</w:t>
       </w:r>
     </w:p>
     <w:p>
@@ -214,6 +234,71 @@
           <w:szCs w:val="24"/>
           <w:u w:val="single"/>
         </w:rPr>
+        <w:t>PUDIERAN OCASIONARSE POR EL LEVANTAMIENTO DE UN</w:t>
+      </w:r>
+    </w:p>
+    <w:p>
+      <w:pPr>
+        <w:framePr w:w="11210" w:h="1120" w:hRule="exact" w:wrap="auto" w:vAnchor="page" w:hAnchor="page" w:x="511" w:y="661"/>
+        <w:widowControl w:val="0"/>
+        <w:tabs>
+          <w:tab w:val="left" w:pos="360"/>
+          <w:tab w:val="left" w:pos="720"/>
+          <w:tab w:val="left" w:pos="1080"/>
+          <w:tab w:val="left" w:pos="1440"/>
+          <w:tab w:val="left" w:pos="1800"/>
+          <w:tab w:val="left" w:pos="2160"/>
+          <w:tab w:val="left" w:pos="2520"/>
+          <w:tab w:val="left" w:pos="2880"/>
+          <w:tab w:val="left" w:pos="3240"/>
+          <w:tab w:val="left" w:pos="3600"/>
+          <w:tab w:val="left" w:pos="3960"/>
+          <w:tab w:val="left" w:pos="4320"/>
+          <w:tab w:val="left" w:pos="4680"/>
+          <w:tab w:val="left" w:pos="5040"/>
+          <w:tab w:val="left" w:pos="5400"/>
+          <w:tab w:val="left" w:pos="5760"/>
+          <w:tab w:val="left" w:pos="6120"/>
+          <w:tab w:val="left" w:pos="6480"/>
+          <w:tab w:val="left" w:pos="6840"/>
+          <w:tab w:val="left" w:pos="7200"/>
+          <w:tab w:val="left" w:pos="7560"/>
+          <w:tab w:val="left" w:pos="7920"/>
+          <w:tab w:val="left" w:pos="8280"/>
+          <w:tab w:val="left" w:pos="8640"/>
+          <w:tab w:val="left" w:pos="9000"/>
+          <w:tab w:val="left" w:pos="9360"/>
+          <w:tab w:val="left" w:pos="9720"/>
+          <w:tab w:val="left" w:pos="10080"/>
+          <w:tab w:val="left" w:pos="10440"/>
+          <w:tab w:val="left" w:pos="10800"/>
+          <w:tab w:val="left" w:pos="11160"/>
+        </w:tabs>
+        <w:autoSpaceDE w:val="0"/>
+        <w:autoSpaceDN w:val="0"/>
+        <w:adjustRightInd w:val="0"/>
+        <w:spacing w:after="0" w:line="240" w:lineRule="auto"/>
+        <w:jc w:val="center"/>
+        <w:rPr>
+          <w:rFonts w:ascii="Arial" w:eastAsia="Times New Roman" w:hAnsi="Arial" w:cs="Arial"/>
+          <w:b/>
+          <w:color w:val="000000"/>
+          <w:kern w:val="2"/>
+          <w:sz w:val="27"/>
+          <w:szCs w:val="24"/>
+          <w:u w:val="single"/>
+        </w:rPr>
+      </w:pPr>
+      <w:r>
+        <w:rPr>
+          <w:rFonts w:ascii="Arial" w:eastAsia="Times New Roman" w:hAnsi="Arial" w:cs="Arial"/>
+          <w:b/>
+          <w:color w:val="000000"/>
+          <w:kern w:val="2"/>
+          <w:sz w:val="27"/>
+          <w:szCs w:val="24"/>
+          <w:u w:val="single"/>
+        </w:rPr>
         <w:t>SECUESTRO</w:t>
       </w:r>
     </w:p>
@@ -264,7 +349,31 @@
           <w:sz w:val="19"/>
           <w:szCs w:val="24"/>
         </w:rPr>
-        <w:t>{custom.NumeroFianza}</w:t>
+        <w:t>{</w:t>
+      </w:r>
+      <w:proofErr w:type="spellStart"/>
+      <w:r>
+        <w:rPr>
+          <w:rFonts w:ascii="Arial" w:eastAsia="Times New Roman" w:hAnsi="Arial" w:cs="Arial"/>
+          <w:b/>
+          <w:color w:val="000000"/>
+          <w:kern w:val="2"/>
+          <w:sz w:val="19"/>
+          <w:szCs w:val="24"/>
+        </w:rPr>
+        <w:t>custom.NumeroFianza</w:t>
+      </w:r>
+      <w:proofErr w:type="spellEnd"/>
+      <w:r>
+        <w:rPr>
+          <w:rFonts w:ascii="Arial" w:eastAsia="Times New Roman" w:hAnsi="Arial" w:cs="Arial"/>
+          <w:b/>
+          <w:color w:val="000000"/>
+          <w:kern w:val="2"/>
+          <w:sz w:val="19"/>
+          <w:szCs w:val="24"/>
+        </w:rPr>
+        <w:t>}</w:t>
       </w:r>
     </w:p>
     <w:p>
@@ -302,7 +411,29 @@
           <w:sz w:val="19"/>
           <w:szCs w:val="24"/>
         </w:rPr>
-        <w:t>NÚMERO DE FIANZA: {custom.NumeroFianza}</w:t>
+        <w:t>NÚMERO DE FIANZA: {</w:t>
+      </w:r>
+      <w:proofErr w:type="spellStart"/>
+      <w:r>
+        <w:rPr>
+          <w:rFonts w:ascii="Arial" w:eastAsia="Times New Roman" w:hAnsi="Arial" w:cs="Arial"/>
+          <w:color w:val="000000"/>
+          <w:kern w:val="2"/>
+          <w:sz w:val="19"/>
+          <w:szCs w:val="24"/>
+        </w:rPr>
+        <w:t>custom.NumeroFianza</w:t>
+      </w:r>
+      <w:proofErr w:type="spellEnd"/>
+      <w:r>
+        <w:rPr>
+          <w:rFonts w:ascii="Arial" w:eastAsia="Times New Roman" w:hAnsi="Arial" w:cs="Arial"/>
+          <w:color w:val="000000"/>
+          <w:kern w:val="2"/>
+          <w:sz w:val="19"/>
+          <w:szCs w:val="24"/>
+        </w:rPr>
+        <w:t>}</w:t>
       </w:r>
     </w:p>
     <w:p>
@@ -383,7 +514,7 @@
     </w:p>
     <w:p>
       <w:pPr>
-        <w:framePr w:w="7160" w:h="221" w:hRule="exact" w:wrap="auto" w:vAnchor="page" w:hAnchor="page" w:x="4306" w:y="2391"/>
+        <w:framePr w:w="7160" w:h="221" w:hRule="exact" w:wrap="auto" w:vAnchor="page" w:hAnchor="page" w:x="4293" w:y="2619"/>
         <w:widowControl w:val="0"/>
         <w:tabs>
           <w:tab w:val="left" w:pos="360"/>
@@ -428,7 +559,42 @@
           <w:sz w:val="19"/>
           <w:szCs w:val="24"/>
         </w:rPr>
-        <w:t>{custom.Tenedor}</w:t>
+        <w:t>{</w:t>
+      </w:r>
+      <w:proofErr w:type="spellStart"/>
+      <w:r>
+        <w:rPr>
+          <w:rFonts w:ascii="Arial" w:eastAsia="Times New Roman" w:hAnsi="Arial" w:cs="Arial"/>
+          <w:b/>
+          <w:color w:val="000000"/>
+          <w:kern w:val="2"/>
+          <w:sz w:val="19"/>
+          <w:szCs w:val="24"/>
+        </w:rPr>
+        <w:t>custom.</w:t>
+      </w:r>
+      <w:r>
+        <w:rPr>
+          <w:rFonts w:ascii="Arial" w:eastAsia="Times New Roman" w:hAnsi="Arial" w:cs="Arial"/>
+          <w:b/>
+          <w:color w:val="000000"/>
+          <w:kern w:val="2"/>
+          <w:sz w:val="19"/>
+          <w:szCs w:val="24"/>
+        </w:rPr>
+        <w:t>Secuestrante</w:t>
+      </w:r>
+      <w:proofErr w:type="spellEnd"/>
+      <w:r>
+        <w:rPr>
+          <w:rFonts w:ascii="Arial" w:eastAsia="Times New Roman" w:hAnsi="Arial" w:cs="Arial"/>
+          <w:b/>
+          <w:color w:val="000000"/>
+          <w:kern w:val="2"/>
+          <w:sz w:val="19"/>
+          <w:szCs w:val="24"/>
+        </w:rPr>
+        <w:t>}</w:t>
       </w:r>
     </w:p>
     <w:p>
@@ -516,7 +682,31 @@
           <w:sz w:val="19"/>
           <w:szCs w:val="24"/>
         </w:rPr>
-        <w:t>{custom.SumaTextoTotal}</w:t>
+        <w:t>{</w:t>
+      </w:r>
+      <w:proofErr w:type="spellStart"/>
+      <w:r>
+        <w:rPr>
+          <w:rFonts w:ascii="Arial" w:eastAsia="Times New Roman" w:hAnsi="Arial" w:cs="Arial"/>
+          <w:b/>
+          <w:color w:val="000000"/>
+          <w:kern w:val="2"/>
+          <w:sz w:val="19"/>
+          <w:szCs w:val="24"/>
+        </w:rPr>
+        <w:t>custom.SumaTextoTotal</w:t>
+      </w:r>
+      <w:proofErr w:type="spellEnd"/>
+      <w:r>
+        <w:rPr>
+          <w:rFonts w:ascii="Arial" w:eastAsia="Times New Roman" w:hAnsi="Arial" w:cs="Arial"/>
+          <w:b/>
+          <w:color w:val="000000"/>
+          <w:kern w:val="2"/>
+          <w:sz w:val="19"/>
+          <w:szCs w:val="24"/>
+        </w:rPr>
+        <w:t>}</w:t>
       </w:r>
     </w:p>
     <w:p>
@@ -642,7 +832,42 @@
           <w:sz w:val="19"/>
           <w:szCs w:val="24"/>
         </w:rPr>
-        <w:t>{custom.AFavor}</w:t>
+        <w:t>{</w:t>
+      </w:r>
+      <w:proofErr w:type="spellStart"/>
+      <w:r>
+        <w:rPr>
+          <w:rFonts w:ascii="Arial" w:eastAsia="Times New Roman" w:hAnsi="Arial" w:cs="Arial"/>
+          <w:b/>
+          <w:color w:val="000000"/>
+          <w:kern w:val="2"/>
+          <w:sz w:val="19"/>
+          <w:szCs w:val="24"/>
+        </w:rPr>
+        <w:t>custom.</w:t>
+      </w:r>
+      <w:r>
+        <w:rPr>
+          <w:rFonts w:ascii="Arial" w:eastAsia="Times New Roman" w:hAnsi="Arial" w:cs="Arial"/>
+          <w:b/>
+          <w:color w:val="000000"/>
+          <w:kern w:val="2"/>
+          <w:sz w:val="19"/>
+          <w:szCs w:val="24"/>
+        </w:rPr>
+        <w:t>Tenedor</w:t>
+      </w:r>
+      <w:proofErr w:type="spellEnd"/>
+      <w:r>
+        <w:rPr>
+          <w:rFonts w:ascii="Arial" w:eastAsia="Times New Roman" w:hAnsi="Arial" w:cs="Arial"/>
+          <w:b/>
+          <w:color w:val="000000"/>
+          <w:kern w:val="2"/>
+          <w:sz w:val="19"/>
+          <w:szCs w:val="24"/>
+        </w:rPr>
+        <w:t>}</w:t>
       </w:r>
     </w:p>
     <w:p>
@@ -712,7 +937,29 @@
           <w:sz w:val="19"/>
           <w:szCs w:val="24"/>
         </w:rPr>
-        <w:t>{custom.SumaTexto}</w:t>
+        <w:t>{</w:t>
+      </w:r>
+      <w:proofErr w:type="spellStart"/>
+      <w:r>
+        <w:rPr>
+          <w:rFonts w:ascii="Arial" w:eastAsia="Times New Roman" w:hAnsi="Arial" w:cs="Arial"/>
+          <w:color w:val="000000"/>
+          <w:kern w:val="2"/>
+          <w:sz w:val="19"/>
+          <w:szCs w:val="24"/>
+        </w:rPr>
+        <w:t>custom.SumaTexto</w:t>
+      </w:r>
+      <w:proofErr w:type="spellEnd"/>
+      <w:r>
+        <w:rPr>
+          <w:rFonts w:ascii="Arial" w:eastAsia="Times New Roman" w:hAnsi="Arial" w:cs="Arial"/>
+          <w:color w:val="000000"/>
+          <w:kern w:val="2"/>
+          <w:sz w:val="19"/>
+          <w:szCs w:val="24"/>
+        </w:rPr>
+        <w:t>}</w:t>
       </w:r>
       <w:r>
         <w:rPr>
@@ -732,17 +979,123 @@
           <w:sz w:val="19"/>
           <w:szCs w:val="24"/>
         </w:rPr>
-        <w:t>{custom.MonedaMonto}</w:t>
-      </w:r>
-      <w:r>
-        <w:rPr>
-          <w:rFonts w:ascii="Arial" w:eastAsia="Times New Roman" w:hAnsi="Arial" w:cs="Arial"/>
-          <w:color w:val="000000"/>
-          <w:kern w:val="2"/>
-          <w:sz w:val="19"/>
-          <w:szCs w:val="24"/>
-        </w:rPr>
-        <w:t>)  para garantizar el pago de los posibles daños y perjuicios que pudieran ocasionarse a en adelante EL SECUESTRANTE por motivo del levantamiento del secuestro solicitado por {custom.Tenedor} en adelante EL SECUESTRADO dentro del proceso que le seguirá ante los juzgados y tribunales panameños.</w:t>
+        <w:t>{</w:t>
+      </w:r>
+      <w:proofErr w:type="spellStart"/>
+      <w:r>
+        <w:rPr>
+          <w:rFonts w:ascii="Arial" w:eastAsia="Times New Roman" w:hAnsi="Arial" w:cs="Arial"/>
+          <w:color w:val="000000"/>
+          <w:kern w:val="2"/>
+          <w:sz w:val="19"/>
+          <w:szCs w:val="24"/>
+        </w:rPr>
+        <w:t>custom.MonedaMonto</w:t>
+      </w:r>
+      <w:proofErr w:type="spellEnd"/>
+      <w:r>
+        <w:rPr>
+          <w:rFonts w:ascii="Arial" w:eastAsia="Times New Roman" w:hAnsi="Arial" w:cs="Arial"/>
+          <w:color w:val="000000"/>
+          <w:kern w:val="2"/>
+          <w:sz w:val="19"/>
+          <w:szCs w:val="24"/>
+        </w:rPr>
+        <w:t>}</w:t>
+      </w:r>
+      <w:r>
+        <w:rPr>
+          <w:rFonts w:ascii="Arial" w:eastAsia="Times New Roman" w:hAnsi="Arial" w:cs="Arial"/>
+          <w:color w:val="000000"/>
+          <w:kern w:val="2"/>
+          <w:sz w:val="19"/>
+          <w:szCs w:val="24"/>
+        </w:rPr>
+        <w:t>)  para garantizar el pago de los posibles daños y perjuicios que pudieran ocasionarse a</w:t>
+      </w:r>
+      <w:r>
+        <w:rPr>
+          <w:rFonts w:ascii="Arial" w:eastAsia="Times New Roman" w:hAnsi="Arial" w:cs="Arial"/>
+          <w:color w:val="000000"/>
+          <w:kern w:val="2"/>
+          <w:sz w:val="19"/>
+          <w:szCs w:val="24"/>
+        </w:rPr>
+        <w:t xml:space="preserve"> {</w:t>
+      </w:r>
+      <w:proofErr w:type="spellStart"/>
+      <w:r>
+        <w:rPr>
+          <w:rFonts w:ascii="Arial" w:eastAsia="Times New Roman" w:hAnsi="Arial" w:cs="Arial"/>
+          <w:color w:val="000000"/>
+          <w:kern w:val="2"/>
+          <w:sz w:val="19"/>
+          <w:szCs w:val="24"/>
+        </w:rPr>
+        <w:t>custom.</w:t>
+      </w:r>
+      <w:r>
+        <w:rPr>
+          <w:rFonts w:ascii="Arial" w:eastAsia="Times New Roman" w:hAnsi="Arial" w:cs="Arial"/>
+          <w:color w:val="000000"/>
+          <w:kern w:val="2"/>
+          <w:sz w:val="19"/>
+          <w:szCs w:val="24"/>
+        </w:rPr>
+        <w:t>Secuestrante</w:t>
+      </w:r>
+      <w:proofErr w:type="spellEnd"/>
+      <w:r>
+        <w:rPr>
+          <w:rFonts w:ascii="Arial" w:eastAsia="Times New Roman" w:hAnsi="Arial" w:cs="Arial"/>
+          <w:color w:val="000000"/>
+          <w:kern w:val="2"/>
+          <w:sz w:val="19"/>
+          <w:szCs w:val="24"/>
+        </w:rPr>
+        <w:t>},</w:t>
+      </w:r>
+      <w:r>
+        <w:rPr>
+          <w:rFonts w:ascii="Arial" w:eastAsia="Times New Roman" w:hAnsi="Arial" w:cs="Arial"/>
+          <w:color w:val="000000"/>
+          <w:kern w:val="2"/>
+          <w:sz w:val="19"/>
+          <w:szCs w:val="24"/>
+        </w:rPr>
+        <w:t xml:space="preserve"> en adelante EL SECUESTRANTE por motivo del levantamiento del secuestro solicitado por {</w:t>
+      </w:r>
+      <w:proofErr w:type="spellStart"/>
+      <w:r>
+        <w:rPr>
+          <w:rFonts w:ascii="Arial" w:eastAsia="Times New Roman" w:hAnsi="Arial" w:cs="Arial"/>
+          <w:color w:val="000000"/>
+          <w:kern w:val="2"/>
+          <w:sz w:val="19"/>
+          <w:szCs w:val="24"/>
+        </w:rPr>
+        <w:t>custom.</w:t>
+      </w:r>
+      <w:r>
+        <w:rPr>
+          <w:rFonts w:ascii="Arial" w:eastAsia="Times New Roman" w:hAnsi="Arial" w:cs="Arial"/>
+          <w:color w:val="000000"/>
+          <w:kern w:val="2"/>
+          <w:sz w:val="19"/>
+          <w:szCs w:val="24"/>
+        </w:rPr>
+        <w:t>AFavor</w:t>
+      </w:r>
+      <w:proofErr w:type="spellEnd"/>
+      <w:r>
+        <w:rPr>
+          <w:rFonts w:ascii="Arial" w:eastAsia="Times New Roman" w:hAnsi="Arial" w:cs="Arial"/>
+          <w:color w:val="000000"/>
+          <w:kern w:val="2"/>
+          <w:sz w:val="19"/>
+          <w:szCs w:val="24"/>
+        </w:rPr>
+        <w:t>} en adelante EL SECUESTRADO dentro del proceso que le seguirá ante los juzgados y tribunales panameños.</w:t>
       </w:r>
     </w:p>
     <w:p>
@@ -802,17 +1155,71 @@
           <w:sz w:val="19"/>
           <w:szCs w:val="24"/>
         </w:rPr>
-        <w:t xml:space="preserve">Como consecuencia de lo anterior, LA FIADORA, por este medio, constituye la presente fianza a favor del JUZGADO {custom.AFavor} por la suma de </w:t>
-      </w:r>
-      <w:r>
-        <w:rPr>
-          <w:rFonts w:ascii="Arial" w:eastAsia="Times New Roman" w:hAnsi="Arial" w:cs="Arial"/>
-          <w:color w:val="000000"/>
-          <w:kern w:val="2"/>
-          <w:sz w:val="19"/>
-          <w:szCs w:val="24"/>
-        </w:rPr>
-        <w:t>{custom.SumaTexto}</w:t>
+        <w:t>Como consecuencia de lo anterior, LA FIADORA, por este medio, constituye la presente fianza a favor del JUZGADO {</w:t>
+      </w:r>
+      <w:proofErr w:type="spellStart"/>
+      <w:r>
+        <w:rPr>
+          <w:rFonts w:ascii="Arial" w:eastAsia="Times New Roman" w:hAnsi="Arial" w:cs="Arial"/>
+          <w:color w:val="000000"/>
+          <w:kern w:val="2"/>
+          <w:sz w:val="19"/>
+          <w:szCs w:val="24"/>
+        </w:rPr>
+        <w:t>custom.</w:t>
+      </w:r>
+      <w:r>
+        <w:rPr>
+          <w:rFonts w:ascii="Arial" w:eastAsia="Times New Roman" w:hAnsi="Arial" w:cs="Arial"/>
+          <w:color w:val="000000"/>
+          <w:kern w:val="2"/>
+          <w:sz w:val="19"/>
+          <w:szCs w:val="24"/>
+        </w:rPr>
+        <w:t>Tenedor</w:t>
+      </w:r>
+      <w:proofErr w:type="spellEnd"/>
+      <w:r>
+        <w:rPr>
+          <w:rFonts w:ascii="Arial" w:eastAsia="Times New Roman" w:hAnsi="Arial" w:cs="Arial"/>
+          <w:color w:val="000000"/>
+          <w:kern w:val="2"/>
+          <w:sz w:val="19"/>
+          <w:szCs w:val="24"/>
+        </w:rPr>
+        <w:t xml:space="preserve">} por la suma de </w:t>
+      </w:r>
+      <w:r>
+        <w:rPr>
+          <w:rFonts w:ascii="Arial" w:eastAsia="Times New Roman" w:hAnsi="Arial" w:cs="Arial"/>
+          <w:color w:val="000000"/>
+          <w:kern w:val="2"/>
+          <w:sz w:val="19"/>
+          <w:szCs w:val="24"/>
+        </w:rPr>
+        <w:t>{</w:t>
+      </w:r>
+      <w:proofErr w:type="spellStart"/>
+      <w:r>
+        <w:rPr>
+          <w:rFonts w:ascii="Arial" w:eastAsia="Times New Roman" w:hAnsi="Arial" w:cs="Arial"/>
+          <w:color w:val="000000"/>
+          <w:kern w:val="2"/>
+          <w:sz w:val="19"/>
+          <w:szCs w:val="24"/>
+        </w:rPr>
+        <w:t>custom.SumaTexto</w:t>
+      </w:r>
+      <w:proofErr w:type="spellEnd"/>
+      <w:r>
+        <w:rPr>
+          <w:rFonts w:ascii="Arial" w:eastAsia="Times New Roman" w:hAnsi="Arial" w:cs="Arial"/>
+          <w:color w:val="000000"/>
+          <w:kern w:val="2"/>
+          <w:sz w:val="19"/>
+          <w:szCs w:val="24"/>
+        </w:rPr>
+        <w:t>}</w:t>
       </w:r>
       <w:r>
         <w:rPr>
@@ -832,7 +1239,29 @@
           <w:sz w:val="19"/>
           <w:szCs w:val="24"/>
         </w:rPr>
-        <w:t>{sumaMonedaMonto}</w:t>
+        <w:t>{</w:t>
+      </w:r>
+      <w:proofErr w:type="spellStart"/>
+      <w:r>
+        <w:rPr>
+          <w:rFonts w:ascii="Arial" w:eastAsia="Times New Roman" w:hAnsi="Arial" w:cs="Arial"/>
+          <w:color w:val="000000"/>
+          <w:kern w:val="2"/>
+          <w:sz w:val="19"/>
+          <w:szCs w:val="24"/>
+        </w:rPr>
+        <w:t>sumaMonedaMonto</w:t>
+      </w:r>
+      <w:proofErr w:type="spellEnd"/>
+      <w:r>
+        <w:rPr>
+          <w:rFonts w:ascii="Arial" w:eastAsia="Times New Roman" w:hAnsi="Arial" w:cs="Arial"/>
+          <w:color w:val="000000"/>
+          <w:kern w:val="2"/>
+          <w:sz w:val="19"/>
+          <w:szCs w:val="24"/>
+        </w:rPr>
+        <w:t>}</w:t>
       </w:r>
       <w:r>
         <w:rPr>
@@ -1148,7 +1577,29 @@
           <w:sz w:val="19"/>
           <w:szCs w:val="24"/>
         </w:rPr>
-        <w:t>. Para ello, el peticionario deberá presentar copia auténtica de la resolución judicial ejecutoriada emitida emitida por la autoridad competente que condene a</w:t>
+        <w:t xml:space="preserve">. Para ello, el peticionario deberá presentar copia auténtica de la resolución judicial ejecutoriada emitida </w:t>
+      </w:r>
+      <w:proofErr w:type="spellStart"/>
+      <w:r>
+        <w:rPr>
+          <w:rFonts w:ascii="Arial" w:eastAsia="Times New Roman" w:hAnsi="Arial" w:cs="Arial"/>
+          <w:color w:val="000000"/>
+          <w:kern w:val="2"/>
+          <w:sz w:val="19"/>
+          <w:szCs w:val="24"/>
+        </w:rPr>
+        <w:t>emitida</w:t>
+      </w:r>
+      <w:proofErr w:type="spellEnd"/>
+      <w:r>
+        <w:rPr>
+          <w:rFonts w:ascii="Arial" w:eastAsia="Times New Roman" w:hAnsi="Arial" w:cs="Arial"/>
+          <w:color w:val="000000"/>
+          <w:kern w:val="2"/>
+          <w:sz w:val="19"/>
+          <w:szCs w:val="24"/>
+        </w:rPr>
+        <w:t xml:space="preserve"> por la autoridad competente que condene a</w:t>
       </w:r>
       <w:r>
         <w:rPr>
@@ -1467,7 +1918,29 @@
           <w:sz w:val="19"/>
           <w:szCs w:val="24"/>
         </w:rPr>
-        <w:t>{custom.FechaActualTextoMin}</w:t>
+        <w:t>{</w:t>
+      </w:r>
+      <w:proofErr w:type="spellStart"/>
+      <w:r>
+        <w:rPr>
+          <w:rFonts w:ascii="Arial" w:eastAsia="Times New Roman" w:hAnsi="Arial" w:cs="Arial"/>
+          <w:color w:val="000000"/>
+          <w:kern w:val="2"/>
+          <w:sz w:val="19"/>
+          <w:szCs w:val="24"/>
+        </w:rPr>
+        <w:t>custom.FechaActualTextoMin</w:t>
+      </w:r>
+      <w:proofErr w:type="spellEnd"/>
+      <w:r>
+        <w:rPr>
+          <w:rFonts w:ascii="Arial" w:eastAsia="Times New Roman" w:hAnsi="Arial" w:cs="Arial"/>
+          <w:color w:val="000000"/>
+          <w:kern w:val="2"/>
+          <w:sz w:val="19"/>
+          <w:szCs w:val="24"/>
+        </w:rPr>
+        <w:t>}</w:t>
       </w:r>
       <w:r>
         <w:rPr>
@@ -1747,7 +2220,42 @@
           <w:sz w:val="19"/>
           <w:szCs w:val="24"/>
         </w:rPr>
-        <w:t>{custom.Tenedor}</w:t>
+        <w:t>{</w:t>
+      </w:r>
+      <w:proofErr w:type="spellStart"/>
+      <w:r>
+        <w:rPr>
+          <w:rFonts w:ascii="Arial" w:eastAsia="Times New Roman" w:hAnsi="Arial" w:cs="Arial"/>
+          <w:b/>
+          <w:color w:val="000000"/>
+          <w:kern w:val="2"/>
+          <w:sz w:val="19"/>
+          <w:szCs w:val="24"/>
+        </w:rPr>
+        <w:t>custom.</w:t>
+      </w:r>
+      <w:r>
+        <w:rPr>
+          <w:rFonts w:ascii="Arial" w:eastAsia="Times New Roman" w:hAnsi="Arial" w:cs="Arial"/>
+          <w:b/>
+          <w:color w:val="000000"/>
+          <w:kern w:val="2"/>
+          <w:sz w:val="19"/>
+          <w:szCs w:val="24"/>
+        </w:rPr>
+        <w:t>AFavor</w:t>
+      </w:r>
+      <w:proofErr w:type="spellEnd"/>
+      <w:r>
+        <w:rPr>
+          <w:rFonts w:ascii="Arial" w:eastAsia="Times New Roman" w:hAnsi="Arial" w:cs="Arial"/>
+          <w:b/>
+          <w:color w:val="000000"/>
+          <w:kern w:val="2"/>
+          <w:sz w:val="19"/>
+          <w:szCs w:val="24"/>
+        </w:rPr>
+        <w:t>}</w:t>
       </w:r>
     </w:p>
     <w:p>

</xml_diff>